<commit_message>
Add 22 literature review MD files and filled Gap Analysis DOCX
</commit_message>
<xml_diff>
--- a/docs/Review_GapAnalysis_AirQuality.docx
+++ b/docs/Review_GapAnalysis_AirQuality.docx
@@ -68,7 +68,7 @@
         <w:t xml:space="preserve">Program Studi: </w:t>
       </w:r>
       <w:r>
-        <w:t>Sains Data — ITERA</w:t>
+        <w:t xml:space="preserve">Sains Data </w:t>
       </w:r>
     </w:p>
     <w:p>
@@ -168,7 +168,23 @@
         <w:jc w:val="both"/>
       </w:pPr>
       <w:r>
-        <w:t xml:space="preserve">Kualitas udara di kota-kota besar Indonesia, khususnya di wilayah Jawa Barat dan sekitar kawasan metropolitan Bandung, menunjukkan fluktuasi yang signifikan akibat pertumbuhan industri, kepadatan lalu lintas kendaraan bermotor, serta pengaruh faktor meteorologi yang bersifat </w:t>
+        <w:t xml:space="preserve">Kualitas udara di kota-kota besar Indonesia, khususnya di wilayah Jawa Barat dan sekitar kawasan metropolitan Bandung, menunjukkan fluktuasi yang signifikan akibat pertumbuhan industri, kepadatan lalu lintas kendaraan bermotor, serta pengaruh faktor </w:t>
+      </w:r>
+      <w:proofErr w:type="spellStart"/>
+      <w:r>
+        <w:t>meteorologi</w:t>
+      </w:r>
+      <w:proofErr w:type="spellEnd"/>
+      <w:r>
+        <w:t xml:space="preserve"> yang </w:t>
+      </w:r>
+      <w:proofErr w:type="spellStart"/>
+      <w:r>
+        <w:t>bersifat</w:t>
+      </w:r>
+      <w:proofErr w:type="spellEnd"/>
+      <w:r>
+        <w:t xml:space="preserve"> </w:t>
       </w:r>
       <w:proofErr w:type="spellStart"/>
       <w:r>
@@ -3062,6 +3078,7 @@
               <w:rPr>
                 <w:sz w:val="15"/>
               </w:rPr>
+              <w:lastRenderedPageBreak/>
               <w:t>12</w:t>
             </w:r>
           </w:p>
@@ -5264,10 +5281,18 @@
     </w:p>
     <w:p>
       <w:r>
-        <w:t xml:space="preserve">Hampir semua studi Indonesia hanya mencakup Jakarta. Tidak ada studi yang melakukan validasi silang model yang dilatih di Jakarta ke kota lain seperti Bandung, Surabaya, </w:t>
+        <w:t xml:space="preserve">Hampir semua studi Indonesia hanya mencakup Jakarta. Tidak ada studi yang melakukan validasi silang model yang dilatih di Jakarta ke kota lain </w:t>
       </w:r>
       <w:proofErr w:type="spellStart"/>
       <w:r>
+        <w:t>seperti</w:t>
+      </w:r>
+      <w:proofErr w:type="spellEnd"/>
+      <w:r>
+        <w:t xml:space="preserve"> Bandung, Surabaya, </w:t>
+      </w:r>
+      <w:proofErr w:type="spellStart"/>
+      <w:r>
         <w:t>atau</w:t>
       </w:r>
       <w:proofErr w:type="spellEnd"/>
@@ -5302,7 +5327,15 @@
       </w:r>
       <w:proofErr w:type="spellEnd"/>
       <w:r>
-        <w:t xml:space="preserve"> berbeda.</w:t>
+        <w:t xml:space="preserve"> </w:t>
+      </w:r>
+      <w:proofErr w:type="spellStart"/>
+      <w:r>
+        <w:t>berbeda</w:t>
+      </w:r>
+      <w:proofErr w:type="spellEnd"/>
+      <w:r>
+        <w:t>.</w:t>
       </w:r>
     </w:p>
     <w:p>
@@ -5424,11 +5457,61 @@
       <w:pPr>
         <w:pStyle w:val="ListBullet"/>
       </w:pPr>
+      <w:proofErr w:type="spellStart"/>
       <w:r>
         <w:rPr>
           <w:b/>
         </w:rPr>
-        <w:t xml:space="preserve">Kluster C: Explainability &amp; Interpretasi: </w:t>
+        <w:t>Kluster</w:t>
+      </w:r>
+      <w:proofErr w:type="spellEnd"/>
+      <w:r>
+        <w:rPr>
+          <w:b/>
+        </w:rPr>
+        <w:t xml:space="preserve"> C: </w:t>
+      </w:r>
+      <w:proofErr w:type="spellStart"/>
+      <w:r>
+        <w:rPr>
+          <w:b/>
+        </w:rPr>
+        <w:t>Explaina</w:t>
+      </w:r>
+      <w:proofErr w:type="spellEnd"/>
+      <w:r>
+        <w:rPr>
+          <w:b/>
+        </w:rPr>
+        <w:tab/>
+      </w:r>
+      <w:proofErr w:type="spellStart"/>
+      <w:r>
+        <w:rPr>
+          <w:b/>
+        </w:rPr>
+        <w:t>bility</w:t>
+      </w:r>
+      <w:proofErr w:type="spellEnd"/>
+      <w:r>
+        <w:rPr>
+          <w:b/>
+        </w:rPr>
+        <w:t xml:space="preserve"> &amp; </w:t>
+      </w:r>
+      <w:proofErr w:type="spellStart"/>
+      <w:r>
+        <w:rPr>
+          <w:b/>
+        </w:rPr>
+        <w:t>Interpretasi</w:t>
+      </w:r>
+      <w:proofErr w:type="spellEnd"/>
+      <w:r>
+        <w:rPr>
+          <w:b/>
+        </w:rPr>
+        <w:t xml:space="preserve">: </w:t>
       </w:r>
       <w:r>
         <w:t>Paper 5, 12, 13, 14 — SHAP sebagai metode dominan; review global menunjukkan gap XAI di negara berkembang; hanya 1 studi XAI di Indonesia.</w:t>
@@ -6210,6 +6293,7 @@
               <w:rPr>
                 <w:sz w:val="18"/>
               </w:rPr>
+              <w:lastRenderedPageBreak/>
               <w:t>PM2.5 musim kering 2× lebih tinggi dari musim hujan (AAQR, 2021; Atm, 2023)</w:t>
             </w:r>
           </w:p>
@@ -6848,6 +6932,10 @@
     <w:p>
       <w:pPr>
         <w:pStyle w:val="ListNumber"/>
+        <w:numPr>
+          <w:ilvl w:val="0"/>
+          <w:numId w:val="10"/>
+        </w:numPr>
       </w:pPr>
       <w:r>
         <w:rPr>
@@ -7300,6 +7388,12 @@
   </w:num>
   <w:num w:numId="9" w16cid:durableId="976951280">
     <w:abstractNumId w:val="0"/>
+  </w:num>
+  <w:num w:numId="10" w16cid:durableId="1407461627">
+    <w:abstractNumId w:val="7"/>
+    <w:lvlOverride w:ilvl="0">
+      <w:startOverride w:val="1"/>
+    </w:lvlOverride>
   </w:num>
 </w:numbering>
 </file>

</xml_diff>